<commit_message>
MBESS required again; Word markdown tables; line-numbered PDFs; migration guide for 2.0.8
- MBESS is a required import again, as in 2.0.8: without it the d-value,
  R-squared and partial eta-squared intervals were missing or printed as
  placeholders.
- Word: markdown tables keep stock apaquarto spacing (apaTables tables
  use their own Table10 style); markdown tables whose labels share a first
  part number correctly in Word and HTML.
- PDF: a manuscript with numbered-lines: true renders with tables in it;
  the text around each table is numbered, the rows are not.
- A migration guide written for upgraders from 2.0.8, corrected NEWS and
  README, and contributing guide, code of conduct and issue templates.
- apa.cor.table(): show.pvalue is the last argument, so a 2.0.8 call that
  passed landscape by position keeps its meaning. Every example names its
  arguments.
</commit_message>
<xml_diff>
--- a/inst/_extensions/wjschne/apaquarto/apaquarto.docx
+++ b/inst/_extensions/wjschne/apaquarto/apaquarto.docx
@@ -1203,6 +1203,46 @@
     <w:pPr>
       <w:spacing w:before="60" w:after="60"/>
     </w:pPr>
+    <w:tblPr>
+      <w:tblInd w:w="0" w:type="dxa"/>
+      <w:tblBorders>
+        <w:bottom w:val="single" w:sz="4" w:space="0" w:color="auto"/>
+      </w:tblBorders>
+      <w:tblCellMar>
+        <w:top w:w="58" w:type="dxa"/>
+        <w:left w:w="58" w:type="dxa"/>
+        <w:bottom w:w="58" w:type="dxa"/>
+        <w:right w:w="58" w:type="dxa"/>
+      </w:tblCellMar>
+    </w:tblPr>
+    <w:tcPr>
+      <w:vAlign w:val="center"/>
+    </w:tcPr>
+    <w:tblStylePr w:type="firstRow">
+      <w:tblPr/>
+      <w:tcPr>
+        <w:tcBorders>
+          <w:top w:val="single" w:sz="4" w:space="0" w:color="auto"/>
+          <w:left w:val="nil"/>
+          <w:bottom w:val="single" w:sz="4" w:space="0" w:color="auto"/>
+          <w:right w:val="nil"/>
+          <w:insideH w:val="nil"/>
+          <w:insideV w:val="nil"/>
+          <w:tl2br w:val="nil"/>
+          <w:tr2bl w:val="nil"/>
+        </w:tcBorders>
+      </w:tcPr>
+    </w:tblStylePr>
+  </w:style>
+  <w:style w:type="table" w:customStyle="1" w:styleId="Table10">
+    <w:name w:val="Table10"/>
+    <w:semiHidden/>
+    <w:unhideWhenUsed/>
+    <w:qFormat/>
+    <w:rsid w:val="00387689"/>
+    <w:pPr>
+      <w:spacing w:before="60" w:after="60"/>
+    </w:pPr>
     <w:rPr>
       <w:sz w:val="20"/>
       <w:szCs w:val="20"/>

</xml_diff>